<commit_message>
chore: update course code to BCSE302L across presentation deck and final reports
- Updated course code to BCSE302L (Compiler Design) across Slide 1 pill, footer, candidate metadata, and final slide
- Updated course code in IEEE project report (PDF & DOCX), presentation notes, and README.md
- Recompiled Resilient_Compiler_Phase3_Presentation.pdf/.pptx and Resilient_Compiler_Final_Project_Report.pdf/.docx
</commit_message>
<xml_diff>
--- a/Resilient_Compiler_Final_Project_Report.docx
+++ b/Resilient_Compiler_Final_Project_Report.docx
@@ -69,7 +69,7 @@
           <w:b/>
           <w:sz w:val="26"/>
         </w:rPr>
-        <w:t>COMPILER DESIGN LABORATORY (BCSE307P)</w:t>
+        <w:t>COMPILER DESIGN LABORATORY (BCSE302L)</w:t>
         <w:br/>
         <w:t>FINAL PROJECT REPORT</w:t>
         <w:br/>
@@ -129,7 +129,7 @@
           <w:rFonts w:ascii="Times New Roman" w:hAnsi="Times New Roman"/>
           <w:sz w:val="21"/>
         </w:rPr>
-        <w:t>This is to certify that the project report entitled 'Resilient Compiler with Intelligent Error Recovery' submitted by D JOSHUA DANIEL (Reg. No: 24BCE0436) to the School of Computer Science and Engineering, Vellore Institute of Technology, Vellore, is a bonafide record of the authentic work carried out by him under my guidance and supervision for the partial fulfillment of the requirements for the award of the degree of Bachelor of Technology in Computer Science and Engineering in the course BCSE307P — Compiler Design Laboratory during the academic year 2026-2027.</w:t>
+        <w:t>This is to certify that the project report entitled 'Resilient Compiler with Intelligent Error Recovery' submitted by D JOSHUA DANIEL (Reg. No: 24BCE0436) to the School of Computer Science and Engineering, Vellore Institute of Technology, Vellore, is a bonafide record of the authentic work carried out by him under my guidance and supervision for the partial fulfillment of the requirements for the award of the degree of Bachelor of Technology in Computer Science and Engineering in the course BCSE302L — Compiler Design Laboratory during the academic year 2026-2027.</w:t>
       </w:r>
     </w:p>
     <w:p>

</xml_diff>